<commit_message>
feat: real n8n workflow screenshots, white-theme deck, WSQ doc format + custom skills
Courseware:
- Replace rendered diagrams with real n8n canvas screenshots (captured via local
  n8n + Playwright) in the Learner Guide (MD+DOCX) and the slide deck
- Convert the slide deck to an all-white theme (no dark slides); 154 slides
- Switch all documents and slides to Arial; body 11pt
- Add cover pages with course title, n8n + Tertiary Infotech Academy logos, UEN
- Add "© 2026 Tertiary Infotech Academy Pte Ltd" copyright + page numbers on every page
- Add courseware/assets logos

Custom skills (.claude/skills):
- wsq-course-slides, wsq-learner-guide, wsq-lesson-plan — reusable generators
  documenting the WSQ house format (cover/logos/UEN, version control, TOC,
  copyright footer, page numbers, Arial 11pt)

Co-Authored-By: Claude Opus 4.8 (1M context) <noreply@anthropic.com>
</commit_message>
<xml_diff>
--- a/courseware/Lesson Plan - Agentic AI Automation with n8n.docx
+++ b/courseware/Lesson Plan - Agentic AI Automation with n8n.docx
@@ -3,27 +3,90 @@
 <w:document xmlns:wpc="http://schemas.microsoft.com/office/word/2010/wordprocessingCanvas" xmlns:mo="http://schemas.microsoft.com/office/mac/office/2008/main" xmlns:mc="http://schemas.openxmlformats.org/markup-compatibility/2006" xmlns:mv="urn:schemas-microsoft-com:mac:vml" xmlns:o="urn:schemas-microsoft-com:office:office" xmlns:r="http://schemas.openxmlformats.org/officeDocument/2006/relationships" xmlns:m="http://schemas.openxmlformats.org/officeDocument/2006/math" xmlns:v="urn:schemas-microsoft-com:vml" xmlns:wp14="http://schemas.microsoft.com/office/word/2010/wordprocessingDrawing" xmlns:wp="http://schemas.openxmlformats.org/drawingml/2006/wordprocessingDrawing" xmlns:w10="urn:schemas-microsoft-com:office:word" xmlns:w="http://schemas.openxmlformats.org/wordprocessingml/2006/main" xmlns:w14="http://schemas.microsoft.com/office/word/2010/wordml" xmlns:wpg="http://schemas.microsoft.com/office/word/2010/wordprocessingGroup" xmlns:wpi="http://schemas.microsoft.com/office/word/2010/wordprocessingInk" xmlns:wne="http://schemas.microsoft.com/office/word/2006/wordml" xmlns:wps="http://schemas.microsoft.com/office/word/2010/wordprocessingShape" mc:Ignorable="w14 wp14">
   <w:body>
     <w:p/>
-    <w:p/>
-    <w:p/>
-    <w:p/>
-    <w:p/>
     <w:p>
       <w:pPr>
-        <w:spacing w:before="0" w:after="40"/>
+        <w:jc w:val="center"/>
+      </w:pPr>
+      <w:r>
+        <w:drawing>
+          <wp:inline xmlns:a="http://schemas.openxmlformats.org/drawingml/2006/main" xmlns:pic="http://schemas.openxmlformats.org/drawingml/2006/picture">
+            <wp:extent cx="1920240" cy="1920240"/>
+            <wp:docPr id="1" name="Picture 1"/>
+            <wp:cNvGraphicFramePr>
+              <a:graphicFrameLocks noChangeAspect="1"/>
+            </wp:cNvGraphicFramePr>
+            <a:graphic>
+              <a:graphicData uri="http://schemas.openxmlformats.org/drawingml/2006/picture">
+                <pic:pic>
+                  <pic:nvPicPr>
+                    <pic:cNvPr id="0" name="tertiary-infotech-logo.png"/>
+                    <pic:cNvPicPr/>
+                  </pic:nvPicPr>
+                  <pic:blipFill>
+                    <a:blip r:embed="rId9"/>
+                    <a:stretch>
+                      <a:fillRect/>
+                    </a:stretch>
+                  </pic:blipFill>
+                  <pic:spPr>
+                    <a:xfrm>
+                      <a:off x="0" y="0"/>
+                      <a:ext cx="1920240" cy="1920240"/>
+                    </a:xfrm>
+                    <a:prstGeom prst="rect"/>
+                  </pic:spPr>
+                </pic:pic>
+              </a:graphicData>
+            </a:graphic>
+          </wp:inline>
+        </w:drawing>
+      </w:r>
+    </w:p>
+    <w:p>
+      <w:pPr>
+        <w:spacing w:before="40" w:after="20"/>
+        <w:jc w:val="center"/>
+      </w:pPr>
+      <w:r>
+        <w:rPr>
+          <w:b/>
+          <w:color w:val="111827"/>
+          <w:sz w:val="26"/>
+        </w:rPr>
+        <w:t>Tertiary Infotech Academy Pte Ltd</w:t>
+      </w:r>
+    </w:p>
+    <w:p>
+      <w:pPr>
+        <w:spacing w:before="0" w:after="200"/>
+        <w:jc w:val="center"/>
+      </w:pPr>
+      <w:r>
+        <w:rPr>
+          <w:b w:val="0"/>
+          <w:color w:val="555B66"/>
+          <w:sz w:val="20"/>
+        </w:rPr>
+        <w:t>UEN: 201200696W</w:t>
+      </w:r>
+    </w:p>
+    <w:p>
+      <w:pPr>
+        <w:spacing w:before="0" w:after="80"/>
         <w:jc w:val="center"/>
       </w:pPr>
       <w:r>
         <w:rPr>
           <w:b/>
           <w:color w:val="1F6FEB"/>
-          <w:sz w:val="56"/>
+          <w:sz w:val="52"/>
         </w:rPr>
         <w:t>LESSON PLAN</w:t>
       </w:r>
     </w:p>
     <w:p>
       <w:pPr>
-        <w:spacing w:before="120" w:after="120"/>
+        <w:spacing w:before="80" w:after="160"/>
         <w:jc w:val="center"/>
       </w:pPr>
       <w:r>
@@ -37,21 +100,60 @@
     </w:p>
     <w:p>
       <w:pPr>
-        <w:spacing w:before="0" w:after="40"/>
+        <w:jc w:val="center"/>
+      </w:pPr>
+      <w:r>
+        <w:drawing>
+          <wp:inline xmlns:a="http://schemas.openxmlformats.org/drawingml/2006/main" xmlns:pic="http://schemas.openxmlformats.org/drawingml/2006/picture">
+            <wp:extent cx="914400" cy="914400"/>
+            <wp:docPr id="2" name="Picture 2"/>
+            <wp:cNvGraphicFramePr>
+              <a:graphicFrameLocks noChangeAspect="1"/>
+            </wp:cNvGraphicFramePr>
+            <a:graphic>
+              <a:graphicData uri="http://schemas.openxmlformats.org/drawingml/2006/picture">
+                <pic:pic>
+                  <pic:nvPicPr>
+                    <pic:cNvPr id="0" name="n8n-course-logo.png"/>
+                    <pic:cNvPicPr/>
+                  </pic:nvPicPr>
+                  <pic:blipFill>
+                    <a:blip r:embed="rId10"/>
+                    <a:stretch>
+                      <a:fillRect/>
+                    </a:stretch>
+                  </pic:blipFill>
+                  <pic:spPr>
+                    <a:xfrm>
+                      <a:off x="0" y="0"/>
+                      <a:ext cx="914400" cy="914400"/>
+                    </a:xfrm>
+                    <a:prstGeom prst="rect"/>
+                  </pic:spPr>
+                </pic:pic>
+              </a:graphicData>
+            </a:graphic>
+          </wp:inline>
+        </w:drawing>
+      </w:r>
+    </w:p>
+    <w:p>
+      <w:pPr>
+        <w:spacing w:before="80" w:after="40"/>
         <w:jc w:val="center"/>
       </w:pPr>
       <w:r>
         <w:rPr>
           <w:b/>
           <w:color w:val="111827"/>
-          <w:sz w:val="36"/>
+          <w:sz w:val="40"/>
         </w:rPr>
         <w:t>Agentic AI Automation with n8n</w:t>
       </w:r>
     </w:p>
     <w:p>
       <w:pPr>
-        <w:spacing w:before="120" w:after="240"/>
+        <w:spacing w:before="80" w:after="280"/>
         <w:jc w:val="center"/>
       </w:pPr>
       <w:r>
@@ -88,7 +190,7 @@
           <w:color w:val="111827"/>
           <w:sz w:val="26"/>
         </w:rPr>
-        <w:t>TERTIARY INFOTECH ACADEMY PTE. LTD.</w:t>
+        <w:t>Tertiary Infotech Academy Pte Ltd</w:t>
       </w:r>
     </w:p>
     <w:p>
@@ -4711,7 +4813,7 @@
       </w:r>
     </w:p>
     <w:sectPr>
-      <w:footerReference w:type="default" r:id="rId9"/>
+      <w:footerReference w:type="default" r:id="rId11"/>
       <w:pgSz w:w="12240" w:h="15840"/>
       <w:pgMar w:top="1440" w:right="1800" w:bottom="1440" w:left="1800" w:header="720" w:footer="720" w:gutter="0"/>
       <w:cols w:space="720"/>
@@ -4773,7 +4875,7 @@
         <w:color w:val="555B66"/>
         <w:sz w:val="15"/>
       </w:rPr>
-      <w:t>Powered by Tertiary Infotech Academy Pte Ltd  ·  www.tertiaryinfotech.com</w:t>
+      <w:t>© 2026 Tertiary Infotech Academy Pte Ltd. All rights reserved.  ·  www.tertiaryinfotech.com</w:t>
     </w:r>
   </w:p>
 </w:ftr>
@@ -5143,8 +5245,8 @@
     <w:qFormat/>
     <w:rsid w:val="00FC693F"/>
     <w:rPr>
-      <w:rFonts w:ascii="Calibri" w:hAnsi="Calibri"/>
-      <w:sz w:val="21"/>
+      <w:rFonts w:ascii="Arial" w:hAnsi="Arial"/>
+      <w:sz w:val="22"/>
     </w:rPr>
   </w:style>
   <w:style w:type="paragraph" w:styleId="Header">
@@ -5206,7 +5308,7 @@
       <w:outlineLvl w:val="0"/>
     </w:pPr>
     <w:rPr>
-      <w:rFonts w:asciiTheme="majorHAnsi" w:eastAsiaTheme="majorEastAsia" w:hAnsiTheme="majorHAnsi" w:cstheme="majorBidi" w:ascii="Calibri" w:hAnsi="Calibri"/>
+      <w:rFonts w:asciiTheme="majorHAnsi" w:eastAsiaTheme="majorEastAsia" w:hAnsiTheme="majorHAnsi" w:cstheme="majorBidi" w:ascii="Arial" w:hAnsi="Arial"/>
       <w:b/>
       <w:bCs/>
       <w:color w:val="1F6FEB"/>
@@ -5230,7 +5332,7 @@
       <w:outlineLvl w:val="1"/>
     </w:pPr>
     <w:rPr>
-      <w:rFonts w:asciiTheme="majorHAnsi" w:eastAsiaTheme="majorEastAsia" w:hAnsiTheme="majorHAnsi" w:cstheme="majorBidi" w:ascii="Calibri" w:hAnsi="Calibri"/>
+      <w:rFonts w:asciiTheme="majorHAnsi" w:eastAsiaTheme="majorEastAsia" w:hAnsiTheme="majorHAnsi" w:cstheme="majorBidi" w:ascii="Arial" w:hAnsi="Arial"/>
       <w:b/>
       <w:bCs/>
       <w:color w:val="111827"/>
@@ -5254,7 +5356,7 @@
       <w:outlineLvl w:val="2"/>
     </w:pPr>
     <w:rPr>
-      <w:rFonts w:asciiTheme="majorHAnsi" w:eastAsiaTheme="majorEastAsia" w:hAnsiTheme="majorHAnsi" w:cstheme="majorBidi" w:ascii="Calibri" w:hAnsi="Calibri"/>
+      <w:rFonts w:asciiTheme="majorHAnsi" w:eastAsiaTheme="majorEastAsia" w:hAnsiTheme="majorHAnsi" w:cstheme="majorBidi" w:ascii="Arial" w:hAnsi="Arial"/>
       <w:b/>
       <w:bCs/>
       <w:color w:val="1F6FEB"/>
@@ -5496,7 +5598,7 @@
       <w:contextualSpacing/>
     </w:pPr>
     <w:rPr>
-      <w:rFonts w:asciiTheme="majorHAnsi" w:eastAsiaTheme="majorEastAsia" w:hAnsiTheme="majorHAnsi" w:cstheme="majorBidi" w:ascii="Calibri" w:hAnsi="Calibri"/>
+      <w:rFonts w:asciiTheme="majorHAnsi" w:eastAsiaTheme="majorEastAsia" w:hAnsiTheme="majorHAnsi" w:cstheme="majorBidi" w:ascii="Arial" w:hAnsi="Arial"/>
       <w:b/>
       <w:color w:val="111827"/>
       <w:spacing w:val="5"/>

</xml_diff>